<commit_message>
Refresh Job Seekers Playbook v2.1
This commit updates the Job Seekers Playbook v2.1 document with revised content and formatting improvements.
</commit_message>
<xml_diff>
--- a/Job_Seekers_Playbook_v2.1.docx
+++ b/Job_Seekers_Playbook_v2.1.docx
@@ -9,7 +9,7 @@
       <w:r>
         <w:drawing>
           <wp:inline distT="0" distB="0" distL="0" distR="0">
-            <wp:extent cx="4762500" cy="1847850"/>
+            <wp:extent cx="5943600" cy="2304305"/>
             <wp:effectExtent t="0" r="0" b="0" l="0"/>
             <wp:docPr id="1" name="" descr="" title=""/>
             <wp:cNvGraphicFramePr>
@@ -102,7 +102,7 @@
       </w:tblGrid>
       <w:tr>
         <w:trPr>
-          <w:tblHeader/>
+          <w:cantSplit/>
         </w:trPr>
         <w:tc>
           <w:tcPr>
@@ -113,24 +113,23 @@
               <w:bottom w:val="single" w:color="CCCCCC" w:sz="4"/>
               <w:right w:val="single" w:color="CCCCCC" w:sz="4"/>
             </w:tcBorders>
-            <w:shd w:fill="1F3552" w:color="auto" w:val="clear"/>
-            <w:tcMar>
-              <w:top w:type="dxa" w:w="80"/>
-              <w:left w:type="dxa" w:w="100"/>
-              <w:bottom w:type="dxa" w:w="80"/>
-              <w:right w:type="dxa" w:w="100"/>
-            </w:tcMar>
-          </w:tcPr>
-          <w:p>
-            <w:r>
-              <w:rPr>
-                <w:b/>
-                <w:bCs/>
-                <w:color w:val="FFFFFF"/>
-                <w:sz w:val="18"/>
-                <w:szCs w:val="18"/>
-              </w:rPr>
-              <w:t xml:space="preserve"/>
+            <w:tcMar>
+              <w:top w:type="dxa" w:w="80"/>
+              <w:left w:type="dxa" w:w="100"/>
+              <w:bottom w:type="dxa" w:w="80"/>
+              <w:right w:type="dxa" w:w="100"/>
+            </w:tcMar>
+          </w:tcPr>
+          <w:p>
+            <w:pPr>
+              <w:spacing w:after="0"/>
+            </w:pPr>
+            <w:r>
+              <w:rPr>
+                <w:sz w:val="18"/>
+                <w:szCs w:val="18"/>
+              </w:rPr>
+              <w:t xml:space="preserve">Playbook version</w:t>
             </w:r>
           </w:p>
         </w:tc>
@@ -143,29 +142,31 @@
               <w:bottom w:val="single" w:color="CCCCCC" w:sz="4"/>
               <w:right w:val="single" w:color="CCCCCC" w:sz="4"/>
             </w:tcBorders>
-            <w:shd w:fill="1F3552" w:color="auto" w:val="clear"/>
-            <w:tcMar>
-              <w:top w:type="dxa" w:w="80"/>
-              <w:left w:type="dxa" w:w="100"/>
-              <w:bottom w:type="dxa" w:w="80"/>
-              <w:right w:type="dxa" w:w="100"/>
-            </w:tcMar>
-          </w:tcPr>
-          <w:p>
-            <w:r>
-              <w:rPr>
-                <w:b/>
-                <w:bCs/>
-                <w:color w:val="FFFFFF"/>
-                <w:sz w:val="18"/>
-                <w:szCs w:val="18"/>
-              </w:rPr>
-              <w:t xml:space="preserve"/>
+            <w:tcMar>
+              <w:top w:type="dxa" w:w="80"/>
+              <w:left w:type="dxa" w:w="100"/>
+              <w:bottom w:type="dxa" w:w="80"/>
+              <w:right w:type="dxa" w:w="100"/>
+            </w:tcMar>
+          </w:tcPr>
+          <w:p>
+            <w:pPr>
+              <w:spacing w:after="0"/>
+            </w:pPr>
+            <w:r>
+              <w:rPr>
+                <w:sz w:val="18"/>
+                <w:szCs w:val="18"/>
+              </w:rPr>
+              <w:t xml:space="preserve">v2.1 — September 2026 (readability edition)</w:t>
             </w:r>
           </w:p>
         </w:tc>
       </w:tr>
       <w:tr>
+        <w:trPr>
+          <w:cantSplit/>
+        </w:trPr>
         <w:tc>
           <w:tcPr>
             <w:tcW w:type="pct" w:w="30%"/>
@@ -191,7 +192,7 @@
                 <w:sz w:val="18"/>
                 <w:szCs w:val="18"/>
               </w:rPr>
-              <w:t xml:space="preserve">Playbook version</w:t>
+              <w:t xml:space="preserve">Repo sync date</w:t>
             </w:r>
           </w:p>
         </w:tc>
@@ -220,12 +221,15 @@
                 <w:sz w:val="18"/>
                 <w:szCs w:val="18"/>
               </w:rPr>
-              <w:t xml:space="preserve">v2.1 — September 2026 (readability edition)</w:t>
+              <w:t xml:space="preserve">September 6, 2026</w:t>
             </w:r>
           </w:p>
         </w:tc>
       </w:tr>
       <w:tr>
+        <w:trPr>
+          <w:cantSplit/>
+        </w:trPr>
         <w:tc>
           <w:tcPr>
             <w:tcW w:type="pct" w:w="30%"/>
@@ -251,7 +255,7 @@
                 <w:sz w:val="18"/>
                 <w:szCs w:val="18"/>
               </w:rPr>
-              <w:t xml:space="preserve">Repo sync date</w:t>
+              <w:t xml:space="preserve">Library status</w:t>
             </w:r>
           </w:p>
         </w:tc>
@@ -280,12 +284,15 @@
                 <w:sz w:val="18"/>
                 <w:szCs w:val="18"/>
               </w:rPr>
-              <w:t xml:space="preserve">September 6, 2026</w:t>
+              <w:t xml:space="preserve">Repo README v4.0 (Aug 21, 2026) + September hardening</w:t>
             </w:r>
           </w:p>
         </w:tc>
       </w:tr>
       <w:tr>
+        <w:trPr>
+          <w:cantSplit/>
+        </w:trPr>
         <w:tc>
           <w:tcPr>
             <w:tcW w:type="pct" w:w="30%"/>
@@ -311,7 +318,7 @@
                 <w:sz w:val="18"/>
                 <w:szCs w:val="18"/>
               </w:rPr>
-              <w:t xml:space="preserve">Library status</w:t>
+              <w:t xml:space="preserve">Author</w:t>
             </w:r>
           </w:p>
         </w:tc>
@@ -340,12 +347,15 @@
                 <w:sz w:val="18"/>
                 <w:szCs w:val="18"/>
               </w:rPr>
-              <w:t xml:space="preserve">Repo README v4.0 (Aug 21, 2026) + September hardening</w:t>
+              <w:t xml:space="preserve">Scott Malin, CISSP — Cybersecurity &amp; Automation Architect</w:t>
             </w:r>
           </w:p>
         </w:tc>
       </w:tr>
       <w:tr>
+        <w:trPr>
+          <w:cantSplit/>
+        </w:trPr>
         <w:tc>
           <w:tcPr>
             <w:tcW w:type="pct" w:w="30%"/>
@@ -371,7 +381,7 @@
                 <w:sz w:val="18"/>
                 <w:szCs w:val="18"/>
               </w:rPr>
-              <w:t xml:space="preserve">Author</w:t>
+              <w:t xml:space="preserve">Repository</w:t>
             </w:r>
           </w:p>
         </w:tc>
@@ -395,77 +405,24 @@
             <w:pPr>
               <w:spacing w:after="0"/>
             </w:pPr>
-            <w:r>
-              <w:rPr>
-                <w:sz w:val="18"/>
-                <w:szCs w:val="18"/>
-              </w:rPr>
-              <w:t xml:space="preserve">Scott Malin, CISSP — Cybersecurity &amp; Automation Architect</w:t>
-            </w:r>
+            <w:hyperlink r:id="rId169">
+              <w:r>
+                <w:rPr>
+                  <w:sz w:val="18"/>
+                  <w:szCs w:val="18"/>
+                  <w:color w:val="0563C1"/>
+                  <w:u w:val="single"/>
+                </w:rPr>
+                <w:t xml:space="preserve">github.com/scottmalin68-commits/Job-Search-Career-Prompts</w:t>
+              </w:r>
+            </w:hyperlink>
           </w:p>
         </w:tc>
       </w:tr>
       <w:tr>
-        <w:tc>
-          <w:tcPr>
-            <w:tcW w:type="pct" w:w="30%"/>
-            <w:tcBorders>
-              <w:top w:val="single" w:color="CCCCCC" w:sz="4"/>
-              <w:left w:val="single" w:color="CCCCCC" w:sz="4"/>
-              <w:bottom w:val="single" w:color="CCCCCC" w:sz="4"/>
-              <w:right w:val="single" w:color="CCCCCC" w:sz="4"/>
-            </w:tcBorders>
-            <w:tcMar>
-              <w:top w:type="dxa" w:w="80"/>
-              <w:left w:type="dxa" w:w="100"/>
-              <w:bottom w:type="dxa" w:w="80"/>
-              <w:right w:type="dxa" w:w="100"/>
-            </w:tcMar>
-          </w:tcPr>
-          <w:p>
-            <w:pPr>
-              <w:spacing w:after="0"/>
-            </w:pPr>
-            <w:r>
-              <w:rPr>
-                <w:sz w:val="18"/>
-                <w:szCs w:val="18"/>
-              </w:rPr>
-              <w:t xml:space="preserve">Repository</w:t>
-            </w:r>
-          </w:p>
-        </w:tc>
-        <w:tc>
-          <w:tcPr>
-            <w:tcW w:type="pct" w:w="70%"/>
-            <w:tcBorders>
-              <w:top w:val="single" w:color="CCCCCC" w:sz="4"/>
-              <w:left w:val="single" w:color="CCCCCC" w:sz="4"/>
-              <w:bottom w:val="single" w:color="CCCCCC" w:sz="4"/>
-              <w:right w:val="single" w:color="CCCCCC" w:sz="4"/>
-            </w:tcBorders>
-            <w:tcMar>
-              <w:top w:type="dxa" w:w="80"/>
-              <w:left w:type="dxa" w:w="100"/>
-              <w:bottom w:type="dxa" w:w="80"/>
-              <w:right w:type="dxa" w:w="100"/>
-            </w:tcMar>
-          </w:tcPr>
-          <w:p>
-            <w:pPr>
-              <w:spacing w:after="0"/>
-            </w:pPr>
-            <w:r>
-              <w:rPr>
-                <w:sz w:val="18"/>
-                <w:szCs w:val="18"/>
-              </w:rPr>
-              <w:t xml:space="preserve">github.com/scottmalin68-commits/Job-Search-Career-Prompts</w:t>
-            </w:r>
-          </w:p>
-        </w:tc>
-      </w:tr>
-      <w:tr>
+        <w:trPr>
+          <w:cantSplit/>
+        </w:trPr>
         <w:tc>
           <w:tcPr>
             <w:tcW w:type="pct" w:w="30%"/>
@@ -541,7 +498,7 @@
           <w:iCs/>
           <w:color w:val="555555"/>
         </w:rPr>
-        <w:t xml:space="preserve">What changed in this edition: same content as v2.0, reorganized for readability — glossary moved up front, each phase now leads with a short core-path list before the full tool table, lessons learned consolidated into one section, and version numbers trimmed out of the body text (they still live in the tables and the appendix).</w:t>
+        <w:t xml:space="preserve">What changed in this edition: same content as v2.0, reorganized for readability — glossary moved up front, each phase leads with a short core-path list before the tool table, lessons stay with their phase, and version numbers are kept out of the body text. Layout pass: list numbering restarts per phase, extra page breaks removed, and core tool names link to the repo.</w:t>
       </w:r>
     </w:p>
     <w:p>
@@ -737,7 +694,7 @@
         <w:spacing w:after="80"/>
       </w:pPr>
       <w:r>
-        <w:t xml:space="preserve">Lessons learned, all phases</w:t>
+        <w:t xml:space="preserve">Appendix — library map</w:t>
       </w:r>
     </w:p>
     <w:p>
@@ -750,25 +707,7 @@
         <w:spacing w:after="80"/>
       </w:pPr>
       <w:r>
-        <w:t xml:space="preserve">Appendix — library map</w:t>
-      </w:r>
-    </w:p>
-    <w:p>
-      <w:pPr>
-        <w:pStyle w:val="ListParagraph"/>
-        <w:numPr>
-          <w:ilvl w:val="0"/>
-          <w:numId w:val="1"/>
-        </w:numPr>
-        <w:spacing w:after="80"/>
-      </w:pPr>
-      <w:r>
         <w:t xml:space="preserve">How to keep this playbook current</w:t>
-      </w:r>
-    </w:p>
-    <w:p>
-      <w:r>
-        <w:br w:type="page"/>
       </w:r>
     </w:p>
     <w:p>
@@ -1098,11 +1037,6 @@
       </w:pPr>
       <w:r>
         <w:t xml:space="preserve">The 2026 expansion doesn't change that contract. JSON pipelines, X-Ray blueprints, and fit scores are still downstream of your master career profile. If that file is thin, every later tool will correctly refuse to invent the missing proof.</w:t>
-      </w:r>
-    </w:p>
-    <w:p>
-      <w:r>
-        <w:br w:type="page"/>
       </w:r>
     </w:p>
     <w:p>
@@ -1155,6 +1089,7 @@
       <w:tr>
         <w:trPr>
           <w:tblHeader/>
+          <w:cantSplit/>
         </w:trPr>
         <w:tc>
           <w:tcPr>
@@ -1218,6 +1153,9 @@
         </w:tc>
       </w:tr>
       <w:tr>
+        <w:trPr>
+          <w:cantSplit/>
+        </w:trPr>
         <w:tc>
           <w:tcPr>
             <w:tcW w:type="pct" w:w="25%"/>
@@ -1278,6 +1216,9 @@
         </w:tc>
       </w:tr>
       <w:tr>
+        <w:trPr>
+          <w:cantSplit/>
+        </w:trPr>
         <w:tc>
           <w:tcPr>
             <w:tcW w:type="pct" w:w="25%"/>
@@ -1338,6 +1279,9 @@
         </w:tc>
       </w:tr>
       <w:tr>
+        <w:trPr>
+          <w:cantSplit/>
+        </w:trPr>
         <w:tc>
           <w:tcPr>
             <w:tcW w:type="pct" w:w="25%"/>
@@ -1398,6 +1342,9 @@
         </w:tc>
       </w:tr>
       <w:tr>
+        <w:trPr>
+          <w:cantSplit/>
+        </w:trPr>
         <w:tc>
           <w:tcPr>
             <w:tcW w:type="pct" w:w="25%"/>
@@ -1458,6 +1405,9 @@
         </w:tc>
       </w:tr>
       <w:tr>
+        <w:trPr>
+          <w:cantSplit/>
+        </w:trPr>
         <w:tc>
           <w:tcPr>
             <w:tcW w:type="pct" w:w="25%"/>
@@ -1518,6 +1468,9 @@
         </w:tc>
       </w:tr>
       <w:tr>
+        <w:trPr>
+          <w:cantSplit/>
+        </w:trPr>
         <w:tc>
           <w:tcPr>
             <w:tcW w:type="pct" w:w="25%"/>
@@ -1578,6 +1531,9 @@
         </w:tc>
       </w:tr>
       <w:tr>
+        <w:trPr>
+          <w:cantSplit/>
+        </w:trPr>
         <w:tc>
           <w:tcPr>
             <w:tcW w:type="pct" w:w="25%"/>
@@ -1638,6 +1594,9 @@
         </w:tc>
       </w:tr>
       <w:tr>
+        <w:trPr>
+          <w:cantSplit/>
+        </w:trPr>
         <w:tc>
           <w:tcPr>
             <w:tcW w:type="pct" w:w="25%"/>
@@ -1698,6 +1657,9 @@
         </w:tc>
       </w:tr>
       <w:tr>
+        <w:trPr>
+          <w:cantSplit/>
+        </w:trPr>
         <w:tc>
           <w:tcPr>
             <w:tcW w:type="pct" w:w="25%"/>
@@ -1758,6 +1720,9 @@
         </w:tc>
       </w:tr>
       <w:tr>
+        <w:trPr>
+          <w:cantSplit/>
+        </w:trPr>
         <w:tc>
           <w:tcPr>
             <w:tcW w:type="pct" w:w="25%"/>
@@ -1818,6 +1783,9 @@
         </w:tc>
       </w:tr>
       <w:tr>
+        <w:trPr>
+          <w:cantSplit/>
+        </w:trPr>
         <w:tc>
           <w:tcPr>
             <w:tcW w:type="pct" w:w="25%"/>
@@ -1878,6 +1846,9 @@
         </w:tc>
       </w:tr>
       <w:tr>
+        <w:trPr>
+          <w:cantSplit/>
+        </w:trPr>
         <w:tc>
           <w:tcPr>
             <w:tcW w:type="pct" w:w="25%"/>
@@ -1938,6 +1909,9 @@
         </w:tc>
       </w:tr>
       <w:tr>
+        <w:trPr>
+          <w:cantSplit/>
+        </w:trPr>
         <w:tc>
           <w:tcPr>
             <w:tcW w:type="pct" w:w="25%"/>
@@ -2026,6 +2000,7 @@
       <w:tr>
         <w:trPr>
           <w:tblHeader/>
+          <w:cantSplit/>
         </w:trPr>
         <w:tc>
           <w:tcPr>
@@ -2089,6 +2064,9 @@
         </w:tc>
       </w:tr>
       <w:tr>
+        <w:trPr>
+          <w:cantSplit/>
+        </w:trPr>
         <w:tc>
           <w:tcPr>
             <w:tcW w:type="pct" w:w="25%"/>
@@ -2149,6 +2127,9 @@
         </w:tc>
       </w:tr>
       <w:tr>
+        <w:trPr>
+          <w:cantSplit/>
+        </w:trPr>
         <w:tc>
           <w:tcPr>
             <w:tcW w:type="pct" w:w="25%"/>
@@ -2209,6 +2190,9 @@
         </w:tc>
       </w:tr>
       <w:tr>
+        <w:trPr>
+          <w:cantSplit/>
+        </w:trPr>
         <w:tc>
           <w:tcPr>
             <w:tcW w:type="pct" w:w="25%"/>
@@ -2269,6 +2253,9 @@
         </w:tc>
       </w:tr>
       <w:tr>
+        <w:trPr>
+          <w:cantSplit/>
+        </w:trPr>
         <w:tc>
           <w:tcPr>
             <w:tcW w:type="pct" w:w="25%"/>
@@ -2329,6 +2316,9 @@
         </w:tc>
       </w:tr>
       <w:tr>
+        <w:trPr>
+          <w:cantSplit/>
+        </w:trPr>
         <w:tc>
           <w:tcPr>
             <w:tcW w:type="pct" w:w="25%"/>
@@ -2389,6 +2379,9 @@
         </w:tc>
       </w:tr>
       <w:tr>
+        <w:trPr>
+          <w:cantSplit/>
+        </w:trPr>
         <w:tc>
           <w:tcPr>
             <w:tcW w:type="pct" w:w="25%"/>
@@ -2449,6 +2442,9 @@
         </w:tc>
       </w:tr>
       <w:tr>
+        <w:trPr>
+          <w:cantSplit/>
+        </w:trPr>
         <w:tc>
           <w:tcPr>
             <w:tcW w:type="pct" w:w="25%"/>
@@ -2509,6 +2505,9 @@
         </w:tc>
       </w:tr>
       <w:tr>
+        <w:trPr>
+          <w:cantSplit/>
+        </w:trPr>
         <w:tc>
           <w:tcPr>
             <w:tcW w:type="pct" w:w="25%"/>
@@ -2569,6 +2568,9 @@
         </w:tc>
       </w:tr>
       <w:tr>
+        <w:trPr>
+          <w:cantSplit/>
+        </w:trPr>
         <w:tc>
           <w:tcPr>
             <w:tcW w:type="pct" w:w="25%"/>
@@ -2629,6 +2631,9 @@
         </w:tc>
       </w:tr>
       <w:tr>
+        <w:trPr>
+          <w:cantSplit/>
+        </w:trPr>
         <w:tc>
           <w:tcPr>
             <w:tcW w:type="pct" w:w="25%"/>
@@ -2689,6 +2694,9 @@
         </w:tc>
       </w:tr>
       <w:tr>
+        <w:trPr>
+          <w:cantSplit/>
+        </w:trPr>
         <w:tc>
           <w:tcPr>
             <w:tcW w:type="pct" w:w="25%"/>
@@ -2749,6 +2757,9 @@
         </w:tc>
       </w:tr>
       <w:tr>
+        <w:trPr>
+          <w:cantSplit/>
+        </w:trPr>
         <w:tc>
           <w:tcPr>
             <w:tcW w:type="pct" w:w="25%"/>
@@ -2809,6 +2820,9 @@
         </w:tc>
       </w:tr>
       <w:tr>
+        <w:trPr>
+          <w:cantSplit/>
+        </w:trPr>
         <w:tc>
           <w:tcPr>
             <w:tcW w:type="pct" w:w="25%"/>
@@ -2869,6 +2883,9 @@
         </w:tc>
       </w:tr>
       <w:tr>
+        <w:trPr>
+          <w:cantSplit/>
+        </w:trPr>
         <w:tc>
           <w:tcPr>
             <w:tcW w:type="pct" w:w="25%"/>
@@ -2929,6 +2946,9 @@
         </w:tc>
       </w:tr>
       <w:tr>
+        <w:trPr>
+          <w:cantSplit/>
+        </w:trPr>
         <w:tc>
           <w:tcPr>
             <w:tcW w:type="pct" w:w="25%"/>
@@ -2989,11 +3009,6 @@
         </w:tc>
       </w:tr>
     </w:tbl>
-    <w:p>
-      <w:r>
-        <w:br w:type="page"/>
-      </w:r>
-    </w:p>
     <w:p>
       <w:pPr>
         <w:pStyle w:val="Heading1"/>
@@ -3027,6 +3042,9 @@
         <w:gridCol w:w="100"/>
       </w:tblGrid>
       <w:tr>
+        <w:trPr>
+          <w:cantSplit/>
+        </w:trPr>
         <w:tc>
           <w:tcPr>
             <w:tcBorders>
@@ -3224,6 +3242,7 @@
       <w:tr>
         <w:trPr>
           <w:tblHeader/>
+          <w:cantSplit/>
         </w:trPr>
         <w:tc>
           <w:tcPr>
@@ -3317,6 +3336,9 @@
         </w:tc>
       </w:tr>
       <w:tr>
+        <w:trPr>
+          <w:cantSplit/>
+        </w:trPr>
         <w:tc>
           <w:tcPr>
             <w:tcW w:type="pct" w:w="28%"/>
@@ -3337,13 +3359,17 @@
             <w:pPr>
               <w:spacing w:after="0"/>
             </w:pPr>
-            <w:r>
-              <w:rPr>
-                <w:sz w:val="18"/>
-                <w:szCs w:val="18"/>
-              </w:rPr>
-              <w:t xml:space="preserve">Career Interview Data Collector</w:t>
-            </w:r>
+            <w:hyperlink r:id="rId129">
+              <w:r>
+                <w:rPr>
+                  <w:sz w:val="18"/>
+                  <w:szCs w:val="18"/>
+                  <w:color w:val="0563C1"/>
+                  <w:u w:val="single"/>
+                </w:rPr>
+                <w:t xml:space="preserve">Career Interview Data Collector</w:t>
+              </w:r>
+            </w:hyperlink>
           </w:p>
         </w:tc>
         <w:tc>
@@ -3406,6 +3432,9 @@
         </w:tc>
       </w:tr>
       <w:tr>
+        <w:trPr>
+          <w:cantSplit/>
+        </w:trPr>
         <w:tc>
           <w:tcPr>
             <w:tcW w:type="pct" w:w="28%"/>
@@ -3426,13 +3455,17 @@
             <w:pPr>
               <w:spacing w:after="0"/>
             </w:pPr>
-            <w:r>
-              <w:rPr>
-                <w:sz w:val="18"/>
-                <w:szCs w:val="18"/>
-              </w:rPr>
-              <w:t xml:space="preserve">Master Skills &amp; Experience Summary Generator</w:t>
-            </w:r>
+            <w:hyperlink r:id="rId130">
+              <w:r>
+                <w:rPr>
+                  <w:sz w:val="18"/>
+                  <w:szCs w:val="18"/>
+                  <w:color w:val="0563C1"/>
+                  <w:u w:val="single"/>
+                </w:rPr>
+                <w:t xml:space="preserve">Master Skills &amp; Experience Summary Generator</w:t>
+              </w:r>
+            </w:hyperlink>
           </w:p>
         </w:tc>
         <w:tc>
@@ -3495,6 +3528,9 @@
         </w:tc>
       </w:tr>
       <w:tr>
+        <w:trPr>
+          <w:cantSplit/>
+        </w:trPr>
         <w:tc>
           <w:tcPr>
             <w:tcW w:type="pct" w:w="28%"/>
@@ -3515,13 +3551,17 @@
             <w:pPr>
               <w:spacing w:after="0"/>
             </w:pPr>
-            <w:r>
-              <w:rPr>
-                <w:sz w:val="18"/>
-                <w:szCs w:val="18"/>
-              </w:rPr>
-              <w:t xml:space="preserve">Career Data Enhancer</w:t>
-            </w:r>
+            <w:hyperlink r:id="rId131">
+              <w:r>
+                <w:rPr>
+                  <w:sz w:val="18"/>
+                  <w:szCs w:val="18"/>
+                  <w:color w:val="0563C1"/>
+                  <w:u w:val="single"/>
+                </w:rPr>
+                <w:t xml:space="preserve">Career Data Enhancer</w:t>
+              </w:r>
+            </w:hyperlink>
           </w:p>
         </w:tc>
         <w:tc>
@@ -3584,6 +3624,9 @@
         </w:tc>
       </w:tr>
       <w:tr>
+        <w:trPr>
+          <w:cantSplit/>
+        </w:trPr>
         <w:tc>
           <w:tcPr>
             <w:tcW w:type="pct" w:w="28%"/>
@@ -3604,13 +3647,17 @@
             <w:pPr>
               <w:spacing w:after="0"/>
             </w:pPr>
-            <w:r>
-              <w:rPr>
-                <w:sz w:val="18"/>
-                <w:szCs w:val="18"/>
-              </w:rPr>
-              <w:t xml:space="preserve">Career Profile Gap Analysis Engine</w:t>
-            </w:r>
+            <w:hyperlink r:id="rId132">
+              <w:r>
+                <w:rPr>
+                  <w:sz w:val="18"/>
+                  <w:szCs w:val="18"/>
+                  <w:color w:val="0563C1"/>
+                  <w:u w:val="single"/>
+                </w:rPr>
+                <w:t xml:space="preserve">Career Profile Gap Analysis Engine</w:t>
+              </w:r>
+            </w:hyperlink>
           </w:p>
         </w:tc>
         <w:tc>
@@ -3673,6 +3720,9 @@
         </w:tc>
       </w:tr>
       <w:tr>
+        <w:trPr>
+          <w:cantSplit/>
+        </w:trPr>
         <w:tc>
           <w:tcPr>
             <w:tcW w:type="pct" w:w="28%"/>
@@ -3693,13 +3743,17 @@
             <w:pPr>
               <w:spacing w:after="0"/>
             </w:pPr>
-            <w:r>
-              <w:rPr>
-                <w:sz w:val="18"/>
-                <w:szCs w:val="18"/>
-              </w:rPr>
-              <w:t xml:space="preserve">Master Summary Maintenance Engine</w:t>
-            </w:r>
+            <w:hyperlink r:id="rId133">
+              <w:r>
+                <w:rPr>
+                  <w:sz w:val="18"/>
+                  <w:szCs w:val="18"/>
+                  <w:color w:val="0563C1"/>
+                  <w:u w:val="single"/>
+                </w:rPr>
+                <w:t xml:space="preserve">Master Summary Maintenance Engine</w:t>
+              </w:r>
+            </w:hyperlink>
           </w:p>
         </w:tc>
         <w:tc>
@@ -3762,6 +3816,9 @@
         </w:tc>
       </w:tr>
       <w:tr>
+        <w:trPr>
+          <w:cantSplit/>
+        </w:trPr>
         <w:tc>
           <w:tcPr>
             <w:tcW w:type="pct" w:w="28%"/>
@@ -3782,13 +3839,17 @@
             <w:pPr>
               <w:spacing w:after="0"/>
             </w:pPr>
-            <w:r>
-              <w:rPr>
-                <w:sz w:val="18"/>
-                <w:szCs w:val="18"/>
-              </w:rPr>
-              <w:t xml:space="preserve">Career Calibration Engine</w:t>
-            </w:r>
+            <w:hyperlink r:id="rId134">
+              <w:r>
+                <w:rPr>
+                  <w:sz w:val="18"/>
+                  <w:szCs w:val="18"/>
+                  <w:color w:val="0563C1"/>
+                  <w:u w:val="single"/>
+                </w:rPr>
+                <w:t xml:space="preserve">Career Calibration Engine</w:t>
+              </w:r>
+            </w:hyperlink>
           </w:p>
         </w:tc>
         <w:tc>
@@ -3851,6 +3912,9 @@
         </w:tc>
       </w:tr>
       <w:tr>
+        <w:trPr>
+          <w:cantSplit/>
+        </w:trPr>
         <w:tc>
           <w:tcPr>
             <w:tcW w:type="pct" w:w="28%"/>
@@ -3871,13 +3935,17 @@
             <w:pPr>
               <w:spacing w:after="0"/>
             </w:pPr>
-            <w:r>
-              <w:rPr>
-                <w:sz w:val="18"/>
-                <w:szCs w:val="18"/>
-              </w:rPr>
-              <w:t xml:space="preserve">JSON → Canonical Markdown Profile Generator</w:t>
-            </w:r>
+            <w:hyperlink r:id="rId135">
+              <w:r>
+                <w:rPr>
+                  <w:sz w:val="18"/>
+                  <w:szCs w:val="18"/>
+                  <w:color w:val="0563C1"/>
+                  <w:u w:val="single"/>
+                </w:rPr>
+                <w:t xml:space="preserve">JSON → Canonical Markdown Profile Generator</w:t>
+              </w:r>
+            </w:hyperlink>
           </w:p>
         </w:tc>
         <w:tc>
@@ -3973,6 +4041,9 @@
         <w:gridCol w:w="100"/>
       </w:tblGrid>
       <w:tr>
+        <w:trPr>
+          <w:cantSplit/>
+        </w:trPr>
         <w:tc>
           <w:tcPr>
             <w:tcBorders>
@@ -4170,6 +4241,7 @@
       <w:tr>
         <w:trPr>
           <w:tblHeader/>
+          <w:cantSplit/>
         </w:trPr>
         <w:tc>
           <w:tcPr>
@@ -4293,6 +4365,9 @@
         </w:tc>
       </w:tr>
       <w:tr>
+        <w:trPr>
+          <w:cantSplit/>
+        </w:trPr>
         <w:tc>
           <w:tcPr>
             <w:tcW w:type="pct" w:w="18%"/>
@@ -4411,6 +4486,9 @@
         </w:tc>
       </w:tr>
       <w:tr>
+        <w:trPr>
+          <w:cantSplit/>
+        </w:trPr>
         <w:tc>
           <w:tcPr>
             <w:tcW w:type="pct" w:w="18%"/>
@@ -4529,6 +4607,9 @@
         </w:tc>
       </w:tr>
       <w:tr>
+        <w:trPr>
+          <w:cantSplit/>
+        </w:trPr>
         <w:tc>
           <w:tcPr>
             <w:tcW w:type="pct" w:w="18%"/>
@@ -4647,6 +4728,9 @@
         </w:tc>
       </w:tr>
       <w:tr>
+        <w:trPr>
+          <w:cantSplit/>
+        </w:trPr>
         <w:tc>
           <w:tcPr>
             <w:tcW w:type="pct" w:w="18%"/>
@@ -4765,6 +4849,9 @@
         </w:tc>
       </w:tr>
       <w:tr>
+        <w:trPr>
+          <w:cantSplit/>
+        </w:trPr>
         <w:tc>
           <w:tcPr>
             <w:tcW w:type="pct" w:w="18%"/>
@@ -4883,6 +4970,9 @@
         </w:tc>
       </w:tr>
       <w:tr>
+        <w:trPr>
+          <w:cantSplit/>
+        </w:trPr>
         <w:tc>
           <w:tcPr>
             <w:tcW w:type="pct" w:w="18%"/>
@@ -5023,11 +5113,6 @@
       </w:r>
     </w:p>
     <w:p>
-      <w:r>
-        <w:br w:type="page"/>
-      </w:r>
-    </w:p>
-    <w:p>
       <w:pPr>
         <w:pStyle w:val="Heading1"/>
         <w:spacing w:after="200" w:before="400"/>
@@ -5171,7 +5256,7 @@
         <w:pStyle w:val="ListParagraph"/>
         <w:numPr>
           <w:ilvl w:val="0"/>
-          <w:numId w:val="2"/>
+          <w:numId w:val="3"/>
         </w:numPr>
         <w:spacing w:after="80"/>
       </w:pPr>
@@ -5184,7 +5269,7 @@
         <w:pStyle w:val="ListParagraph"/>
         <w:numPr>
           <w:ilvl w:val="0"/>
-          <w:numId w:val="2"/>
+          <w:numId w:val="3"/>
         </w:numPr>
         <w:spacing w:after="80"/>
       </w:pPr>
@@ -5197,7 +5282,7 @@
         <w:pStyle w:val="ListParagraph"/>
         <w:numPr>
           <w:ilvl w:val="0"/>
-          <w:numId w:val="2"/>
+          <w:numId w:val="3"/>
         </w:numPr>
         <w:spacing w:after="80"/>
       </w:pPr>
@@ -5210,7 +5295,7 @@
         <w:pStyle w:val="ListParagraph"/>
         <w:numPr>
           <w:ilvl w:val="0"/>
-          <w:numId w:val="2"/>
+          <w:numId w:val="3"/>
         </w:numPr>
         <w:spacing w:after="80"/>
       </w:pPr>
@@ -5223,7 +5308,7 @@
         <w:pStyle w:val="ListParagraph"/>
         <w:numPr>
           <w:ilvl w:val="0"/>
-          <w:numId w:val="2"/>
+          <w:numId w:val="3"/>
         </w:numPr>
         <w:spacing w:after="80"/>
       </w:pPr>
@@ -5236,7 +5321,7 @@
         <w:pStyle w:val="ListParagraph"/>
         <w:numPr>
           <w:ilvl w:val="0"/>
-          <w:numId w:val="2"/>
+          <w:numId w:val="3"/>
         </w:numPr>
         <w:spacing w:after="80"/>
       </w:pPr>
@@ -5249,7 +5334,7 @@
         <w:pStyle w:val="ListParagraph"/>
         <w:numPr>
           <w:ilvl w:val="0"/>
-          <w:numId w:val="2"/>
+          <w:numId w:val="3"/>
         </w:numPr>
         <w:spacing w:after="80"/>
       </w:pPr>
@@ -5291,6 +5376,7 @@
       <w:tr>
         <w:trPr>
           <w:tblHeader/>
+          <w:cantSplit/>
         </w:trPr>
         <w:tc>
           <w:tcPr>
@@ -5384,6 +5470,9 @@
         </w:tc>
       </w:tr>
       <w:tr>
+        <w:trPr>
+          <w:cantSplit/>
+        </w:trPr>
         <w:tc>
           <w:tcPr>
             <w:tcW w:type="pct" w:w="26%"/>
@@ -5404,13 +5493,17 @@
             <w:pPr>
               <w:spacing w:after="0"/>
             </w:pPr>
-            <w:r>
-              <w:rPr>
-                <w:sz w:val="18"/>
-                <w:szCs w:val="18"/>
-              </w:rPr>
-              <w:t xml:space="preserve">Strategic Integrity Resume Engine</w:t>
-            </w:r>
+            <w:hyperlink r:id="rId136">
+              <w:r>
+                <w:rPr>
+                  <w:sz w:val="18"/>
+                  <w:szCs w:val="18"/>
+                  <w:color w:val="0563C1"/>
+                  <w:u w:val="single"/>
+                </w:rPr>
+                <w:t xml:space="preserve">Strategic Integrity Resume Engine</w:t>
+              </w:r>
+            </w:hyperlink>
           </w:p>
         </w:tc>
         <w:tc>
@@ -5473,6 +5566,9 @@
         </w:tc>
       </w:tr>
       <w:tr>
+        <w:trPr>
+          <w:cantSplit/>
+        </w:trPr>
         <w:tc>
           <w:tcPr>
             <w:tcW w:type="pct" w:w="26%"/>
@@ -5493,13 +5589,17 @@
             <w:pPr>
               <w:spacing w:after="0"/>
             </w:pPr>
-            <w:r>
-              <w:rPr>
-                <w:sz w:val="18"/>
-                <w:szCs w:val="18"/>
-              </w:rPr>
-              <w:t xml:space="preserve">The Total Resume Architect</w:t>
-            </w:r>
+            <w:hyperlink r:id="rId137">
+              <w:r>
+                <w:rPr>
+                  <w:sz w:val="18"/>
+                  <w:szCs w:val="18"/>
+                  <w:color w:val="0563C1"/>
+                  <w:u w:val="single"/>
+                </w:rPr>
+                <w:t xml:space="preserve">The Total Resume Architect</w:t>
+              </w:r>
+            </w:hyperlink>
           </w:p>
         </w:tc>
         <w:tc>
@@ -5562,6 +5662,9 @@
         </w:tc>
       </w:tr>
       <w:tr>
+        <w:trPr>
+          <w:cantSplit/>
+        </w:trPr>
         <w:tc>
           <w:tcPr>
             <w:tcW w:type="pct" w:w="26%"/>
@@ -5582,13 +5685,17 @@
             <w:pPr>
               <w:spacing w:after="0"/>
             </w:pPr>
-            <w:r>
-              <w:rPr>
-                <w:sz w:val="18"/>
-                <w:szCs w:val="18"/>
-              </w:rPr>
-              <w:t xml:space="preserve">ATS Resume Scanner Simulator</w:t>
-            </w:r>
+            <w:hyperlink r:id="rId138">
+              <w:r>
+                <w:rPr>
+                  <w:sz w:val="18"/>
+                  <w:szCs w:val="18"/>
+                  <w:color w:val="0563C1"/>
+                  <w:u w:val="single"/>
+                </w:rPr>
+                <w:t xml:space="preserve">ATS Resume Scanner Simulator</w:t>
+              </w:r>
+            </w:hyperlink>
           </w:p>
         </w:tc>
         <w:tc>
@@ -5651,6 +5758,9 @@
         </w:tc>
       </w:tr>
       <w:tr>
+        <w:trPr>
+          <w:cantSplit/>
+        </w:trPr>
         <w:tc>
           <w:tcPr>
             <w:tcW w:type="pct" w:w="26%"/>
@@ -5671,13 +5781,17 @@
             <w:pPr>
               <w:spacing w:after="0"/>
             </w:pPr>
-            <w:r>
-              <w:rPr>
-                <w:sz w:val="18"/>
-                <w:szCs w:val="18"/>
-              </w:rPr>
-              <w:t xml:space="preserve">ATS Parse-Aware Optimization Layer</w:t>
-            </w:r>
+            <w:hyperlink r:id="rId139">
+              <w:r>
+                <w:rPr>
+                  <w:sz w:val="18"/>
+                  <w:szCs w:val="18"/>
+                  <w:color w:val="0563C1"/>
+                  <w:u w:val="single"/>
+                </w:rPr>
+                <w:t xml:space="preserve">ATS Parse-Aware Optimization Layer</w:t>
+              </w:r>
+            </w:hyperlink>
           </w:p>
         </w:tc>
         <w:tc>
@@ -5740,6 +5854,9 @@
         </w:tc>
       </w:tr>
       <w:tr>
+        <w:trPr>
+          <w:cantSplit/>
+        </w:trPr>
         <w:tc>
           <w:tcPr>
             <w:tcW w:type="pct" w:w="26%"/>
@@ -5760,13 +5877,17 @@
             <w:pPr>
               <w:spacing w:after="0"/>
             </w:pPr>
-            <w:r>
-              <w:rPr>
-                <w:sz w:val="18"/>
-                <w:szCs w:val="18"/>
-              </w:rPr>
-              <w:t xml:space="preserve">Resume Redline</w:t>
-            </w:r>
+            <w:hyperlink r:id="rId140">
+              <w:r>
+                <w:rPr>
+                  <w:sz w:val="18"/>
+                  <w:szCs w:val="18"/>
+                  <w:color w:val="0563C1"/>
+                  <w:u w:val="single"/>
+                </w:rPr>
+                <w:t xml:space="preserve">Resume Redline</w:t>
+              </w:r>
+            </w:hyperlink>
           </w:p>
         </w:tc>
         <w:tc>
@@ -5829,6 +5950,9 @@
         </w:tc>
       </w:tr>
       <w:tr>
+        <w:trPr>
+          <w:cantSplit/>
+        </w:trPr>
         <w:tc>
           <w:tcPr>
             <w:tcW w:type="pct" w:w="26%"/>
@@ -5849,13 +5973,17 @@
             <w:pPr>
               <w:spacing w:after="0"/>
             </w:pPr>
-            <w:r>
-              <w:rPr>
-                <w:sz w:val="18"/>
-                <w:szCs w:val="18"/>
-              </w:rPr>
-              <w:t xml:space="preserve">Customizable Job Scanner</w:t>
-            </w:r>
+            <w:hyperlink r:id="rId141">
+              <w:r>
+                <w:rPr>
+                  <w:sz w:val="18"/>
+                  <w:szCs w:val="18"/>
+                  <w:color w:val="0563C1"/>
+                  <w:u w:val="single"/>
+                </w:rPr>
+                <w:t xml:space="preserve">Customizable Job Scanner</w:t>
+              </w:r>
+            </w:hyperlink>
           </w:p>
         </w:tc>
         <w:tc>
@@ -5918,6 +6046,9 @@
         </w:tc>
       </w:tr>
       <w:tr>
+        <w:trPr>
+          <w:cantSplit/>
+        </w:trPr>
         <w:tc>
           <w:tcPr>
             <w:tcW w:type="pct" w:w="26%"/>
@@ -5938,13 +6069,17 @@
             <w:pPr>
               <w:spacing w:after="0"/>
             </w:pPr>
-            <w:r>
-              <w:rPr>
-                <w:sz w:val="18"/>
-                <w:szCs w:val="18"/>
-              </w:rPr>
-              <w:t xml:space="preserve">LinkedIn Profile Surgeon + Mirror Engines</w:t>
-            </w:r>
+            <w:hyperlink r:id="rId142">
+              <w:r>
+                <w:rPr>
+                  <w:sz w:val="18"/>
+                  <w:szCs w:val="18"/>
+                  <w:color w:val="0563C1"/>
+                  <w:u w:val="single"/>
+                </w:rPr>
+                <w:t xml:space="preserve">LinkedIn Profile Surgeon + Mirror Engines</w:t>
+              </w:r>
+            </w:hyperlink>
           </w:p>
         </w:tc>
         <w:tc>
@@ -6007,6 +6142,9 @@
         </w:tc>
       </w:tr>
       <w:tr>
+        <w:trPr>
+          <w:cantSplit/>
+        </w:trPr>
         <w:tc>
           <w:tcPr>
             <w:tcW w:type="pct" w:w="26%"/>
@@ -6027,13 +6165,17 @@
             <w:pPr>
               <w:spacing w:after="0"/>
             </w:pPr>
-            <w:r>
-              <w:rPr>
-                <w:sz w:val="18"/>
-                <w:szCs w:val="18"/>
-              </w:rPr>
-              <w:t xml:space="preserve">Job posting red-flag analyzer</w:t>
-            </w:r>
+            <w:hyperlink r:id="rId143">
+              <w:r>
+                <w:rPr>
+                  <w:sz w:val="18"/>
+                  <w:szCs w:val="18"/>
+                  <w:color w:val="0563C1"/>
+                  <w:u w:val="single"/>
+                </w:rPr>
+                <w:t xml:space="preserve">Job posting red-flag analyzer</w:t>
+              </w:r>
+            </w:hyperlink>
           </w:p>
         </w:tc>
         <w:tc>
@@ -6096,6 +6238,9 @@
         </w:tc>
       </w:tr>
       <w:tr>
+        <w:trPr>
+          <w:cantSplit/>
+        </w:trPr>
         <w:tc>
           <w:tcPr>
             <w:tcW w:type="pct" w:w="26%"/>
@@ -6116,13 +6261,17 @@
             <w:pPr>
               <w:spacing w:after="0"/>
             </w:pPr>
-            <w:r>
-              <w:rPr>
-                <w:sz w:val="18"/>
-                <w:szCs w:val="18"/>
-              </w:rPr>
-              <w:t xml:space="preserve">OverWatch suite</w:t>
-            </w:r>
+            <w:hyperlink r:id="rId144">
+              <w:r>
+                <w:rPr>
+                  <w:sz w:val="18"/>
+                  <w:szCs w:val="18"/>
+                  <w:color w:val="0563C1"/>
+                  <w:u w:val="single"/>
+                </w:rPr>
+                <w:t xml:space="preserve">OverWatch suite</w:t>
+              </w:r>
+            </w:hyperlink>
           </w:p>
         </w:tc>
         <w:tc>
@@ -6206,6 +6355,9 @@
         <w:gridCol w:w="100"/>
       </w:tblGrid>
       <w:tr>
+        <w:trPr>
+          <w:cantSplit/>
+        </w:trPr>
         <w:tc>
           <w:tcPr>
             <w:tcBorders>
@@ -6291,11 +6443,6 @@
       </w:tr>
     </w:tbl>
     <w:p>
-      <w:r>
-        <w:br w:type="page"/>
-      </w:r>
-    </w:p>
-    <w:p>
       <w:pPr>
         <w:pStyle w:val="Heading1"/>
         <w:spacing w:after="200" w:before="400"/>
@@ -6326,7 +6473,7 @@
         <w:pStyle w:val="ListParagraph"/>
         <w:numPr>
           <w:ilvl w:val="0"/>
-          <w:numId w:val="2"/>
+          <w:numId w:val="4"/>
         </w:numPr>
         <w:spacing w:after="80"/>
       </w:pPr>
@@ -6339,7 +6486,7 @@
         <w:pStyle w:val="ListParagraph"/>
         <w:numPr>
           <w:ilvl w:val="0"/>
-          <w:numId w:val="2"/>
+          <w:numId w:val="4"/>
         </w:numPr>
         <w:spacing w:after="80"/>
       </w:pPr>
@@ -6352,7 +6499,7 @@
         <w:pStyle w:val="ListParagraph"/>
         <w:numPr>
           <w:ilvl w:val="0"/>
-          <w:numId w:val="2"/>
+          <w:numId w:val="4"/>
         </w:numPr>
         <w:spacing w:after="80"/>
       </w:pPr>
@@ -6365,7 +6512,7 @@
         <w:pStyle w:val="ListParagraph"/>
         <w:numPr>
           <w:ilvl w:val="0"/>
-          <w:numId w:val="2"/>
+          <w:numId w:val="4"/>
         </w:numPr>
         <w:spacing w:after="80"/>
       </w:pPr>
@@ -6378,7 +6525,7 @@
         <w:pStyle w:val="ListParagraph"/>
         <w:numPr>
           <w:ilvl w:val="0"/>
-          <w:numId w:val="2"/>
+          <w:numId w:val="4"/>
         </w:numPr>
         <w:spacing w:after="80"/>
       </w:pPr>
@@ -6391,7 +6538,7 @@
         <w:pStyle w:val="ListParagraph"/>
         <w:numPr>
           <w:ilvl w:val="0"/>
-          <w:numId w:val="2"/>
+          <w:numId w:val="4"/>
         </w:numPr>
         <w:spacing w:after="80"/>
       </w:pPr>
@@ -6404,7 +6551,7 @@
         <w:pStyle w:val="ListParagraph"/>
         <w:numPr>
           <w:ilvl w:val="0"/>
-          <w:numId w:val="2"/>
+          <w:numId w:val="4"/>
         </w:numPr>
         <w:spacing w:after="80"/>
       </w:pPr>
@@ -6417,7 +6564,7 @@
         <w:pStyle w:val="ListParagraph"/>
         <w:numPr>
           <w:ilvl w:val="0"/>
-          <w:numId w:val="2"/>
+          <w:numId w:val="4"/>
         </w:numPr>
         <w:spacing w:after="80"/>
       </w:pPr>
@@ -6472,6 +6619,7 @@
       <w:tr>
         <w:trPr>
           <w:tblHeader/>
+          <w:cantSplit/>
         </w:trPr>
         <w:tc>
           <w:tcPr>
@@ -6565,6 +6713,9 @@
         </w:tc>
       </w:tr>
       <w:tr>
+        <w:trPr>
+          <w:cantSplit/>
+        </w:trPr>
         <w:tc>
           <w:tcPr>
             <w:tcW w:type="pct" w:w="30%"/>
@@ -6585,13 +6736,17 @@
             <w:pPr>
               <w:spacing w:after="0"/>
             </w:pPr>
-            <w:r>
-              <w:rPr>
-                <w:sz w:val="18"/>
-                <w:szCs w:val="18"/>
-              </w:rPr>
-              <w:t xml:space="preserve">Dead Job Posting Recovery Engine</w:t>
-            </w:r>
+            <w:hyperlink r:id="rId145">
+              <w:r>
+                <w:rPr>
+                  <w:sz w:val="18"/>
+                  <w:szCs w:val="18"/>
+                  <w:color w:val="0563C1"/>
+                  <w:u w:val="single"/>
+                </w:rPr>
+                <w:t xml:space="preserve">Dead Job Posting Recovery Engine</w:t>
+              </w:r>
+            </w:hyperlink>
           </w:p>
         </w:tc>
         <w:tc>
@@ -6654,6 +6809,9 @@
         </w:tc>
       </w:tr>
       <w:tr>
+        <w:trPr>
+          <w:cantSplit/>
+        </w:trPr>
         <w:tc>
           <w:tcPr>
             <w:tcW w:type="pct" w:w="30%"/>
@@ -6674,13 +6832,17 @@
             <w:pPr>
               <w:spacing w:after="0"/>
             </w:pPr>
-            <w:r>
-              <w:rPr>
-                <w:sz w:val="18"/>
-                <w:szCs w:val="18"/>
-              </w:rPr>
-              <w:t xml:space="preserve">Company Technical Intelligence Engine / JD Tech Stack Recon</w:t>
-            </w:r>
+            <w:hyperlink r:id="rId146">
+              <w:r>
+                <w:rPr>
+                  <w:sz w:val="18"/>
+                  <w:szCs w:val="18"/>
+                  <w:color w:val="0563C1"/>
+                  <w:u w:val="single"/>
+                </w:rPr>
+                <w:t xml:space="preserve">Company Technical Intelligence Engine / JD Tech Stack Recon</w:t>
+              </w:r>
+            </w:hyperlink>
           </w:p>
         </w:tc>
         <w:tc>
@@ -6743,6 +6905,9 @@
         </w:tc>
       </w:tr>
       <w:tr>
+        <w:trPr>
+          <w:cantSplit/>
+        </w:trPr>
         <w:tc>
           <w:tcPr>
             <w:tcW w:type="pct" w:w="30%"/>
@@ -6763,13 +6928,17 @@
             <w:pPr>
               <w:spacing w:after="0"/>
             </w:pPr>
-            <w:r>
-              <w:rPr>
-                <w:sz w:val="18"/>
-                <w:szCs w:val="18"/>
-              </w:rPr>
-              <w:t xml:space="preserve">Hiring Manager Detective</w:t>
-            </w:r>
+            <w:hyperlink r:id="rId147">
+              <w:r>
+                <w:rPr>
+                  <w:sz w:val="18"/>
+                  <w:szCs w:val="18"/>
+                  <w:color w:val="0563C1"/>
+                  <w:u w:val="single"/>
+                </w:rPr>
+                <w:t xml:space="preserve">Hiring Manager Detective</w:t>
+              </w:r>
+            </w:hyperlink>
           </w:p>
         </w:tc>
         <w:tc>
@@ -6832,6 +7001,9 @@
         </w:tc>
       </w:tr>
       <w:tr>
+        <w:trPr>
+          <w:cantSplit/>
+        </w:trPr>
         <w:tc>
           <w:tcPr>
             <w:tcW w:type="pct" w:w="30%"/>
@@ -6852,13 +7024,17 @@
             <w:pPr>
               <w:spacing w:after="0"/>
             </w:pPr>
-            <w:r>
-              <w:rPr>
-                <w:sz w:val="18"/>
-                <w:szCs w:val="18"/>
-              </w:rPr>
-              <w:t xml:space="preserve">AI Job Scout &amp; Fit Evaluator</w:t>
-            </w:r>
+            <w:hyperlink r:id="rId148">
+              <w:r>
+                <w:rPr>
+                  <w:sz w:val="18"/>
+                  <w:szCs w:val="18"/>
+                  <w:color w:val="0563C1"/>
+                  <w:u w:val="single"/>
+                </w:rPr>
+                <w:t xml:space="preserve">AI Job Scout &amp; Fit Evaluator</w:t>
+              </w:r>
+            </w:hyperlink>
           </w:p>
         </w:tc>
         <w:tc>
@@ -6921,6 +7097,9 @@
         </w:tc>
       </w:tr>
       <w:tr>
+        <w:trPr>
+          <w:cantSplit/>
+        </w:trPr>
         <w:tc>
           <w:tcPr>
             <w:tcW w:type="pct" w:w="30%"/>
@@ -6941,13 +7120,17 @@
             <w:pPr>
               <w:spacing w:after="0"/>
             </w:pPr>
-            <w:r>
-              <w:rPr>
-                <w:sz w:val="18"/>
-                <w:szCs w:val="18"/>
-              </w:rPr>
-              <w:t xml:space="preserve">Opportunity Intelligence &amp; Positioning Engine</w:t>
-            </w:r>
+            <w:hyperlink r:id="rId149">
+              <w:r>
+                <w:rPr>
+                  <w:sz w:val="18"/>
+                  <w:szCs w:val="18"/>
+                  <w:color w:val="0563C1"/>
+                  <w:u w:val="single"/>
+                </w:rPr>
+                <w:t xml:space="preserve">Opportunity Intelligence &amp; Positioning Engine</w:t>
+              </w:r>
+            </w:hyperlink>
           </w:p>
         </w:tc>
         <w:tc>
@@ -7031,6 +7214,9 @@
         <w:gridCol w:w="100"/>
       </w:tblGrid>
       <w:tr>
+        <w:trPr>
+          <w:cantSplit/>
+        </w:trPr>
         <w:tc>
           <w:tcPr>
             <w:tcBorders>
@@ -7142,11 +7328,6 @@
       </w:tr>
     </w:tbl>
     <w:p>
-      <w:r>
-        <w:br w:type="page"/>
-      </w:r>
-    </w:p>
-    <w:p>
       <w:pPr>
         <w:pStyle w:val="Heading1"/>
         <w:spacing w:after="200" w:before="400"/>
@@ -7177,7 +7358,7 @@
         <w:pStyle w:val="ListParagraph"/>
         <w:numPr>
           <w:ilvl w:val="0"/>
-          <w:numId w:val="2"/>
+          <w:numId w:val="5"/>
         </w:numPr>
         <w:spacing w:after="80"/>
       </w:pPr>
@@ -7190,7 +7371,7 @@
         <w:pStyle w:val="ListParagraph"/>
         <w:numPr>
           <w:ilvl w:val="0"/>
-          <w:numId w:val="2"/>
+          <w:numId w:val="5"/>
         </w:numPr>
         <w:spacing w:after="80"/>
       </w:pPr>
@@ -7203,7 +7384,7 @@
         <w:pStyle w:val="ListParagraph"/>
         <w:numPr>
           <w:ilvl w:val="0"/>
-          <w:numId w:val="2"/>
+          <w:numId w:val="5"/>
         </w:numPr>
         <w:spacing w:after="80"/>
       </w:pPr>
@@ -7216,7 +7397,7 @@
         <w:pStyle w:val="ListParagraph"/>
         <w:numPr>
           <w:ilvl w:val="0"/>
-          <w:numId w:val="2"/>
+          <w:numId w:val="5"/>
         </w:numPr>
         <w:spacing w:after="80"/>
       </w:pPr>
@@ -7229,7 +7410,7 @@
         <w:pStyle w:val="ListParagraph"/>
         <w:numPr>
           <w:ilvl w:val="0"/>
-          <w:numId w:val="2"/>
+          <w:numId w:val="5"/>
         </w:numPr>
         <w:spacing w:after="80"/>
       </w:pPr>
@@ -7251,7 +7432,7 @@
         <w:pStyle w:val="ListParagraph"/>
         <w:numPr>
           <w:ilvl w:val="0"/>
-          <w:numId w:val="2"/>
+          <w:numId w:val="6"/>
         </w:numPr>
         <w:spacing w:after="80"/>
       </w:pPr>
@@ -7264,7 +7445,7 @@
         <w:pStyle w:val="ListParagraph"/>
         <w:numPr>
           <w:ilvl w:val="0"/>
-          <w:numId w:val="2"/>
+          <w:numId w:val="6"/>
         </w:numPr>
         <w:spacing w:after="80"/>
       </w:pPr>
@@ -7277,7 +7458,7 @@
         <w:pStyle w:val="ListParagraph"/>
         <w:numPr>
           <w:ilvl w:val="0"/>
-          <w:numId w:val="2"/>
+          <w:numId w:val="6"/>
         </w:numPr>
         <w:spacing w:after="80"/>
       </w:pPr>
@@ -7290,7 +7471,7 @@
         <w:pStyle w:val="ListParagraph"/>
         <w:numPr>
           <w:ilvl w:val="0"/>
-          <w:numId w:val="2"/>
+          <w:numId w:val="6"/>
         </w:numPr>
         <w:spacing w:after="80"/>
       </w:pPr>
@@ -7329,7 +7510,7 @@
         <w:pStyle w:val="ListParagraph"/>
         <w:numPr>
           <w:ilvl w:val="0"/>
-          <w:numId w:val="2"/>
+          <w:numId w:val="7"/>
         </w:numPr>
         <w:spacing w:after="80"/>
       </w:pPr>
@@ -7342,7 +7523,7 @@
         <w:pStyle w:val="ListParagraph"/>
         <w:numPr>
           <w:ilvl w:val="0"/>
-          <w:numId w:val="2"/>
+          <w:numId w:val="7"/>
         </w:numPr>
         <w:spacing w:after="80"/>
       </w:pPr>
@@ -7355,7 +7536,7 @@
         <w:pStyle w:val="ListParagraph"/>
         <w:numPr>
           <w:ilvl w:val="0"/>
-          <w:numId w:val="2"/>
+          <w:numId w:val="7"/>
         </w:numPr>
         <w:spacing w:after="80"/>
       </w:pPr>
@@ -7368,7 +7549,7 @@
         <w:pStyle w:val="ListParagraph"/>
         <w:numPr>
           <w:ilvl w:val="0"/>
-          <w:numId w:val="2"/>
+          <w:numId w:val="7"/>
         </w:numPr>
         <w:spacing w:after="80"/>
       </w:pPr>
@@ -7410,6 +7591,7 @@
       <w:tr>
         <w:trPr>
           <w:tblHeader/>
+          <w:cantSplit/>
         </w:trPr>
         <w:tc>
           <w:tcPr>
@@ -7503,6 +7685,9 @@
         </w:tc>
       </w:tr>
       <w:tr>
+        <w:trPr>
+          <w:cantSplit/>
+        </w:trPr>
         <w:tc>
           <w:tcPr>
             <w:tcW w:type="pct" w:w="26%"/>
@@ -7523,13 +7708,17 @@
             <w:pPr>
               <w:spacing w:after="0"/>
             </w:pPr>
-            <w:r>
-              <w:rPr>
-                <w:sz w:val="18"/>
-                <w:szCs w:val="18"/>
-              </w:rPr>
-              <w:t xml:space="preserve">OSINT JSON → Interview Prep Renderer</w:t>
-            </w:r>
+            <w:hyperlink r:id="rId150">
+              <w:r>
+                <w:rPr>
+                  <w:sz w:val="18"/>
+                  <w:szCs w:val="18"/>
+                  <w:color w:val="0563C1"/>
+                  <w:u w:val="single"/>
+                </w:rPr>
+                <w:t xml:space="preserve">OSINT JSON → Interview Prep Renderer</w:t>
+              </w:r>
+            </w:hyperlink>
           </w:p>
         </w:tc>
         <w:tc>
@@ -7592,6 +7781,9 @@
         </w:tc>
       </w:tr>
       <w:tr>
+        <w:trPr>
+          <w:cantSplit/>
+        </w:trPr>
         <w:tc>
           <w:tcPr>
             <w:tcW w:type="pct" w:w="26%"/>
@@ -7612,13 +7804,17 @@
             <w:pPr>
               <w:spacing w:after="0"/>
             </w:pPr>
-            <w:r>
-              <w:rPr>
-                <w:sz w:val="18"/>
-                <w:szCs w:val="18"/>
-              </w:rPr>
-              <w:t xml:space="preserve">The Universal Interview Architect</w:t>
-            </w:r>
+            <w:hyperlink r:id="rId151">
+              <w:r>
+                <w:rPr>
+                  <w:sz w:val="18"/>
+                  <w:szCs w:val="18"/>
+                  <w:color w:val="0563C1"/>
+                  <w:u w:val="single"/>
+                </w:rPr>
+                <w:t xml:space="preserve">The Universal Interview Architect</w:t>
+              </w:r>
+            </w:hyperlink>
           </w:p>
         </w:tc>
         <w:tc>
@@ -7681,6 +7877,9 @@
         </w:tc>
       </w:tr>
       <w:tr>
+        <w:trPr>
+          <w:cantSplit/>
+        </w:trPr>
         <w:tc>
           <w:tcPr>
             <w:tcW w:type="pct" w:w="26%"/>
@@ -7701,13 +7900,17 @@
             <w:pPr>
               <w:spacing w:after="0"/>
             </w:pPr>
-            <w:r>
-              <w:rPr>
-                <w:sz w:val="18"/>
-                <w:szCs w:val="18"/>
-              </w:rPr>
-              <w:t xml:space="preserve">Interview Intelligence Engine</w:t>
-            </w:r>
+            <w:hyperlink r:id="rId152">
+              <w:r>
+                <w:rPr>
+                  <w:sz w:val="18"/>
+                  <w:szCs w:val="18"/>
+                  <w:color w:val="0563C1"/>
+                  <w:u w:val="single"/>
+                </w:rPr>
+                <w:t xml:space="preserve">Interview Intelligence Engine</w:t>
+              </w:r>
+            </w:hyperlink>
           </w:p>
         </w:tc>
         <w:tc>
@@ -7770,6 +7973,9 @@
         </w:tc>
       </w:tr>
       <w:tr>
+        <w:trPr>
+          <w:cantSplit/>
+        </w:trPr>
         <w:tc>
           <w:tcPr>
             <w:tcW w:type="pct" w:w="26%"/>
@@ -7790,13 +7996,17 @@
             <w:pPr>
               <w:spacing w:after="0"/>
             </w:pPr>
-            <w:r>
-              <w:rPr>
-                <w:sz w:val="18"/>
-                <w:szCs w:val="18"/>
-              </w:rPr>
-              <w:t xml:space="preserve">Interview Pressure Simulators</w:t>
-            </w:r>
+            <w:hyperlink r:id="rId153">
+              <w:r>
+                <w:rPr>
+                  <w:sz w:val="18"/>
+                  <w:szCs w:val="18"/>
+                  <w:color w:val="0563C1"/>
+                  <w:u w:val="single"/>
+                </w:rPr>
+                <w:t xml:space="preserve">Interview Pressure Simulators</w:t>
+              </w:r>
+            </w:hyperlink>
           </w:p>
         </w:tc>
         <w:tc>
@@ -7859,6 +8069,9 @@
         </w:tc>
       </w:tr>
       <w:tr>
+        <w:trPr>
+          <w:cantSplit/>
+        </w:trPr>
         <w:tc>
           <w:tcPr>
             <w:tcW w:type="pct" w:w="26%"/>
@@ -7879,13 +8092,17 @@
             <w:pPr>
               <w:spacing w:after="0"/>
             </w:pPr>
-            <w:r>
-              <w:rPr>
-                <w:sz w:val="18"/>
-                <w:szCs w:val="18"/>
-              </w:rPr>
-              <w:t xml:space="preserve">Voice interview suites</w:t>
-            </w:r>
+            <w:hyperlink r:id="rId154">
+              <w:r>
+                <w:rPr>
+                  <w:sz w:val="18"/>
+                  <w:szCs w:val="18"/>
+                  <w:color w:val="0563C1"/>
+                  <w:u w:val="single"/>
+                </w:rPr>
+                <w:t xml:space="preserve">Voice interview suites</w:t>
+              </w:r>
+            </w:hyperlink>
           </w:p>
         </w:tc>
         <w:tc>
@@ -7948,6 +8165,9 @@
         </w:tc>
       </w:tr>
       <w:tr>
+        <w:trPr>
+          <w:cantSplit/>
+        </w:trPr>
         <w:tc>
           <w:tcPr>
             <w:tcW w:type="pct" w:w="26%"/>
@@ -7968,13 +8188,17 @@
             <w:pPr>
               <w:spacing w:after="0"/>
             </w:pPr>
-            <w:r>
-              <w:rPr>
-                <w:sz w:val="18"/>
-                <w:szCs w:val="18"/>
-              </w:rPr>
-              <w:t xml:space="preserve">Post-Interview Rapid Recall Engine</w:t>
-            </w:r>
+            <w:hyperlink r:id="rId155">
+              <w:r>
+                <w:rPr>
+                  <w:sz w:val="18"/>
+                  <w:szCs w:val="18"/>
+                  <w:color w:val="0563C1"/>
+                  <w:u w:val="single"/>
+                </w:rPr>
+                <w:t xml:space="preserve">Post-Interview Rapid Recall Engine</w:t>
+              </w:r>
+            </w:hyperlink>
           </w:p>
         </w:tc>
         <w:tc>
@@ -8037,6 +8261,9 @@
         </w:tc>
       </w:tr>
       <w:tr>
+        <w:trPr>
+          <w:cantSplit/>
+        </w:trPr>
         <w:tc>
           <w:tcPr>
             <w:tcW w:type="pct" w:w="26%"/>
@@ -8057,13 +8284,17 @@
             <w:pPr>
               <w:spacing w:after="0"/>
             </w:pPr>
-            <w:r>
-              <w:rPr>
-                <w:sz w:val="18"/>
-                <w:szCs w:val="18"/>
-              </w:rPr>
-              <w:t xml:space="preserve">Post-Interview Thank You Note Generator</w:t>
-            </w:r>
+            <w:hyperlink r:id="rId156">
+              <w:r>
+                <w:rPr>
+                  <w:sz w:val="18"/>
+                  <w:szCs w:val="18"/>
+                  <w:color w:val="0563C1"/>
+                  <w:u w:val="single"/>
+                </w:rPr>
+                <w:t xml:space="preserve">Post-Interview Thank You Note Generator</w:t>
+              </w:r>
+            </w:hyperlink>
           </w:p>
         </w:tc>
         <w:tc>
@@ -8126,6 +8357,9 @@
         </w:tc>
       </w:tr>
       <w:tr>
+        <w:trPr>
+          <w:cantSplit/>
+        </w:trPr>
         <w:tc>
           <w:tcPr>
             <w:tcW w:type="pct" w:w="26%"/>
@@ -8146,13 +8380,17 @@
             <w:pPr>
               <w:spacing w:after="0"/>
             </w:pPr>
-            <w:r>
-              <w:rPr>
-                <w:sz w:val="18"/>
-                <w:szCs w:val="18"/>
-              </w:rPr>
-              <w:t xml:space="preserve">The Day 0 Onboarding Strategist</w:t>
-            </w:r>
+            <w:hyperlink r:id="rId157">
+              <w:r>
+                <w:rPr>
+                  <w:sz w:val="18"/>
+                  <w:szCs w:val="18"/>
+                  <w:color w:val="0563C1"/>
+                  <w:u w:val="single"/>
+                </w:rPr>
+                <w:t xml:space="preserve">The Day 0 Onboarding Strategist</w:t>
+              </w:r>
+            </w:hyperlink>
           </w:p>
         </w:tc>
         <w:tc>
@@ -8236,6 +8474,9 @@
         <w:gridCol w:w="100"/>
       </w:tblGrid>
       <w:tr>
+        <w:trPr>
+          <w:cantSplit/>
+        </w:trPr>
         <w:tc>
           <w:tcPr>
             <w:tcBorders>
@@ -8347,11 +8588,6 @@
       </w:tr>
     </w:tbl>
     <w:p>
-      <w:r>
-        <w:br w:type="page"/>
-      </w:r>
-    </w:p>
-    <w:p>
       <w:pPr>
         <w:pStyle w:val="Heading1"/>
         <w:spacing w:after="200" w:before="400"/>
@@ -8382,7 +8618,7 @@
         <w:pStyle w:val="ListParagraph"/>
         <w:numPr>
           <w:ilvl w:val="0"/>
-          <w:numId w:val="2"/>
+          <w:numId w:val="8"/>
         </w:numPr>
         <w:spacing w:after="80"/>
       </w:pPr>
@@ -8395,7 +8631,7 @@
         <w:pStyle w:val="ListParagraph"/>
         <w:numPr>
           <w:ilvl w:val="0"/>
-          <w:numId w:val="2"/>
+          <w:numId w:val="8"/>
         </w:numPr>
         <w:spacing w:after="80"/>
       </w:pPr>
@@ -8408,7 +8644,7 @@
         <w:pStyle w:val="ListParagraph"/>
         <w:numPr>
           <w:ilvl w:val="0"/>
-          <w:numId w:val="2"/>
+          <w:numId w:val="8"/>
         </w:numPr>
         <w:spacing w:after="80"/>
       </w:pPr>
@@ -8430,7 +8666,7 @@
         <w:pStyle w:val="ListParagraph"/>
         <w:numPr>
           <w:ilvl w:val="0"/>
-          <w:numId w:val="2"/>
+          <w:numId w:val="9"/>
         </w:numPr>
         <w:spacing w:after="80"/>
       </w:pPr>
@@ -8443,7 +8679,7 @@
         <w:pStyle w:val="ListParagraph"/>
         <w:numPr>
           <w:ilvl w:val="0"/>
-          <w:numId w:val="2"/>
+          <w:numId w:val="9"/>
         </w:numPr>
         <w:spacing w:after="80"/>
       </w:pPr>
@@ -8456,7 +8692,7 @@
         <w:pStyle w:val="ListParagraph"/>
         <w:numPr>
           <w:ilvl w:val="0"/>
-          <w:numId w:val="2"/>
+          <w:numId w:val="9"/>
         </w:numPr>
         <w:spacing w:after="80"/>
       </w:pPr>
@@ -8469,7 +8705,7 @@
         <w:pStyle w:val="ListParagraph"/>
         <w:numPr>
           <w:ilvl w:val="0"/>
-          <w:numId w:val="2"/>
+          <w:numId w:val="9"/>
         </w:numPr>
         <w:spacing w:after="80"/>
       </w:pPr>
@@ -8491,7 +8727,7 @@
         <w:pStyle w:val="ListParagraph"/>
         <w:numPr>
           <w:ilvl w:val="0"/>
-          <w:numId w:val="2"/>
+          <w:numId w:val="10"/>
         </w:numPr>
         <w:spacing w:after="80"/>
       </w:pPr>
@@ -8504,7 +8740,7 @@
         <w:pStyle w:val="ListParagraph"/>
         <w:numPr>
           <w:ilvl w:val="0"/>
-          <w:numId w:val="2"/>
+          <w:numId w:val="10"/>
         </w:numPr>
         <w:spacing w:after="80"/>
       </w:pPr>
@@ -8517,7 +8753,7 @@
         <w:pStyle w:val="ListParagraph"/>
         <w:numPr>
           <w:ilvl w:val="0"/>
-          <w:numId w:val="2"/>
+          <w:numId w:val="10"/>
         </w:numPr>
         <w:spacing w:after="80"/>
       </w:pPr>
@@ -8539,7 +8775,7 @@
         <w:pStyle w:val="ListParagraph"/>
         <w:numPr>
           <w:ilvl w:val="0"/>
-          <w:numId w:val="2"/>
+          <w:numId w:val="11"/>
         </w:numPr>
         <w:spacing w:after="80"/>
       </w:pPr>
@@ -8552,7 +8788,7 @@
         <w:pStyle w:val="ListParagraph"/>
         <w:numPr>
           <w:ilvl w:val="0"/>
-          <w:numId w:val="2"/>
+          <w:numId w:val="11"/>
         </w:numPr>
         <w:spacing w:after="80"/>
       </w:pPr>
@@ -8565,7 +8801,7 @@
         <w:pStyle w:val="ListParagraph"/>
         <w:numPr>
           <w:ilvl w:val="0"/>
-          <w:numId w:val="2"/>
+          <w:numId w:val="11"/>
         </w:numPr>
         <w:spacing w:after="80"/>
       </w:pPr>
@@ -8578,7 +8814,7 @@
         <w:pStyle w:val="ListParagraph"/>
         <w:numPr>
           <w:ilvl w:val="0"/>
-          <w:numId w:val="2"/>
+          <w:numId w:val="11"/>
         </w:numPr>
         <w:spacing w:after="80"/>
       </w:pPr>
@@ -8600,7 +8836,7 @@
         <w:pStyle w:val="ListParagraph"/>
         <w:numPr>
           <w:ilvl w:val="0"/>
-          <w:numId w:val="2"/>
+          <w:numId w:val="12"/>
         </w:numPr>
         <w:spacing w:after="80"/>
       </w:pPr>
@@ -8613,7 +8849,7 @@
         <w:pStyle w:val="ListParagraph"/>
         <w:numPr>
           <w:ilvl w:val="0"/>
-          <w:numId w:val="2"/>
+          <w:numId w:val="12"/>
         </w:numPr>
         <w:spacing w:after="80"/>
       </w:pPr>
@@ -8626,7 +8862,7 @@
         <w:pStyle w:val="ListParagraph"/>
         <w:numPr>
           <w:ilvl w:val="0"/>
-          <w:numId w:val="2"/>
+          <w:numId w:val="12"/>
         </w:numPr>
         <w:spacing w:after="80"/>
       </w:pPr>
@@ -8668,6 +8904,7 @@
       <w:tr>
         <w:trPr>
           <w:tblHeader/>
+          <w:cantSplit/>
         </w:trPr>
         <w:tc>
           <w:tcPr>
@@ -8761,6 +8998,9 @@
         </w:tc>
       </w:tr>
       <w:tr>
+        <w:trPr>
+          <w:cantSplit/>
+        </w:trPr>
         <w:tc>
           <w:tcPr>
             <w:tcW w:type="pct" w:w="28%"/>
@@ -8781,13 +9021,17 @@
             <w:pPr>
               <w:spacing w:after="0"/>
             </w:pPr>
-            <w:r>
-              <w:rPr>
-                <w:sz w:val="18"/>
-                <w:szCs w:val="18"/>
-              </w:rPr>
-              <w:t xml:space="preserve">Hiring manager response decoder</w:t>
-            </w:r>
+            <w:hyperlink r:id="rId158">
+              <w:r>
+                <w:rPr>
+                  <w:sz w:val="18"/>
+                  <w:szCs w:val="18"/>
+                  <w:color w:val="0563C1"/>
+                  <w:u w:val="single"/>
+                </w:rPr>
+                <w:t xml:space="preserve">Hiring manager response decoder</w:t>
+              </w:r>
+            </w:hyperlink>
           </w:p>
         </w:tc>
         <w:tc>
@@ -8850,6 +9094,9 @@
         </w:tc>
       </w:tr>
       <w:tr>
+        <w:trPr>
+          <w:cantSplit/>
+        </w:trPr>
         <w:tc>
           <w:tcPr>
             <w:tcW w:type="pct" w:w="28%"/>
@@ -8870,13 +9117,17 @@
             <w:pPr>
               <w:spacing w:after="0"/>
             </w:pPr>
-            <w:r>
-              <w:rPr>
-                <w:sz w:val="18"/>
-                <w:szCs w:val="18"/>
-              </w:rPr>
-              <w:t xml:space="preserve">SONEE (Safe Offer Negotiation Assistant)</w:t>
-            </w:r>
+            <w:hyperlink r:id="rId159">
+              <w:r>
+                <w:rPr>
+                  <w:sz w:val="18"/>
+                  <w:szCs w:val="18"/>
+                  <w:color w:val="0563C1"/>
+                  <w:u w:val="single"/>
+                </w:rPr>
+                <w:t xml:space="preserve">SONEE (Safe Offer Negotiation Assistant)</w:t>
+              </w:r>
+            </w:hyperlink>
           </w:p>
         </w:tc>
         <w:tc>
@@ -8939,6 +9190,9 @@
         </w:tc>
       </w:tr>
       <w:tr>
+        <w:trPr>
+          <w:cantSplit/>
+        </w:trPr>
         <w:tc>
           <w:tcPr>
             <w:tcW w:type="pct" w:w="28%"/>
@@ -8959,13 +9213,17 @@
             <w:pPr>
               <w:spacing w:after="0"/>
             </w:pPr>
-            <w:r>
-              <w:rPr>
-                <w:sz w:val="18"/>
-                <w:szCs w:val="18"/>
-              </w:rPr>
-              <w:t xml:space="preserve">Pre-Day-One Positioning Engine</w:t>
-            </w:r>
+            <w:hyperlink r:id="rId160">
+              <w:r>
+                <w:rPr>
+                  <w:sz w:val="18"/>
+                  <w:szCs w:val="18"/>
+                  <w:color w:val="0563C1"/>
+                  <w:u w:val="single"/>
+                </w:rPr>
+                <w:t xml:space="preserve">Pre-Day-One Positioning Engine</w:t>
+              </w:r>
+            </w:hyperlink>
           </w:p>
         </w:tc>
         <w:tc>
@@ -9028,6 +9286,9 @@
         </w:tc>
       </w:tr>
       <w:tr>
+        <w:trPr>
+          <w:cantSplit/>
+        </w:trPr>
         <w:tc>
           <w:tcPr>
             <w:tcW w:type="pct" w:w="28%"/>
@@ -9048,13 +9309,17 @@
             <w:pPr>
               <w:spacing w:after="0"/>
             </w:pPr>
-            <w:r>
-              <w:rPr>
-                <w:sz w:val="18"/>
-                <w:szCs w:val="18"/>
-              </w:rPr>
-              <w:t xml:space="preserve">The Day 0 Onboarding Strategist</w:t>
-            </w:r>
+            <w:hyperlink r:id="rId161">
+              <w:r>
+                <w:rPr>
+                  <w:sz w:val="18"/>
+                  <w:szCs w:val="18"/>
+                  <w:color w:val="0563C1"/>
+                  <w:u w:val="single"/>
+                </w:rPr>
+                <w:t xml:space="preserve">The Day 0 Onboarding Strategist</w:t>
+              </w:r>
+            </w:hyperlink>
           </w:p>
         </w:tc>
         <w:tc>
@@ -9117,6 +9382,9 @@
         </w:tc>
       </w:tr>
       <w:tr>
+        <w:trPr>
+          <w:cantSplit/>
+        </w:trPr>
         <w:tc>
           <w:tcPr>
             <w:tcW w:type="pct" w:w="28%"/>
@@ -9137,13 +9405,17 @@
             <w:pPr>
               <w:spacing w:after="0"/>
             </w:pPr>
-            <w:r>
-              <w:rPr>
-                <w:sz w:val="18"/>
-                <w:szCs w:val="18"/>
-              </w:rPr>
-              <w:t xml:space="preserve">Career Landing Page Engine</w:t>
-            </w:r>
+            <w:hyperlink r:id="rId162">
+              <w:r>
+                <w:rPr>
+                  <w:sz w:val="18"/>
+                  <w:szCs w:val="18"/>
+                  <w:color w:val="0563C1"/>
+                  <w:u w:val="single"/>
+                </w:rPr>
+                <w:t xml:space="preserve">Career Landing Page Engine</w:t>
+              </w:r>
+            </w:hyperlink>
           </w:p>
         </w:tc>
         <w:tc>
@@ -9206,6 +9478,9 @@
         </w:tc>
       </w:tr>
       <w:tr>
+        <w:trPr>
+          <w:cantSplit/>
+        </w:trPr>
         <w:tc>
           <w:tcPr>
             <w:tcW w:type="pct" w:w="28%"/>
@@ -9226,13 +9501,17 @@
             <w:pPr>
               <w:spacing w:after="0"/>
             </w:pPr>
-            <w:r>
-              <w:rPr>
-                <w:sz w:val="18"/>
-                <w:szCs w:val="18"/>
-              </w:rPr>
-              <w:t xml:space="preserve">Master Summary Maintenance Engine</w:t>
-            </w:r>
+            <w:hyperlink r:id="rId163">
+              <w:r>
+                <w:rPr>
+                  <w:sz w:val="18"/>
+                  <w:szCs w:val="18"/>
+                  <w:color w:val="0563C1"/>
+                  <w:u w:val="single"/>
+                </w:rPr>
+                <w:t xml:space="preserve">Master Summary Maintenance Engine</w:t>
+              </w:r>
+            </w:hyperlink>
           </w:p>
         </w:tc>
         <w:tc>
@@ -9316,6 +9595,9 @@
         <w:gridCol w:w="100"/>
       </w:tblGrid>
       <w:tr>
+        <w:trPr>
+          <w:cantSplit/>
+        </w:trPr>
         <w:tc>
           <w:tcPr>
             <w:tcBorders>
@@ -9427,11 +9709,6 @@
       </w:tr>
     </w:tbl>
     <w:p>
-      <w:r>
-        <w:br w:type="page"/>
-      </w:r>
-    </w:p>
-    <w:p>
       <w:pPr>
         <w:pStyle w:val="Heading1"/>
         <w:spacing w:after="200" w:before="400"/>
@@ -9462,7 +9739,7 @@
         <w:pStyle w:val="ListParagraph"/>
         <w:numPr>
           <w:ilvl w:val="0"/>
-          <w:numId w:val="2"/>
+          <w:numId w:val="13"/>
         </w:numPr>
         <w:spacing w:after="80"/>
       </w:pPr>
@@ -9475,7 +9752,7 @@
         <w:pStyle w:val="ListParagraph"/>
         <w:numPr>
           <w:ilvl w:val="0"/>
-          <w:numId w:val="2"/>
+          <w:numId w:val="13"/>
         </w:numPr>
         <w:spacing w:after="80"/>
       </w:pPr>
@@ -9488,7 +9765,7 @@
         <w:pStyle w:val="ListParagraph"/>
         <w:numPr>
           <w:ilvl w:val="0"/>
-          <w:numId w:val="2"/>
+          <w:numId w:val="13"/>
         </w:numPr>
         <w:spacing w:after="80"/>
       </w:pPr>
@@ -9510,7 +9787,7 @@
         <w:pStyle w:val="ListParagraph"/>
         <w:numPr>
           <w:ilvl w:val="0"/>
-          <w:numId w:val="2"/>
+          <w:numId w:val="14"/>
         </w:numPr>
         <w:spacing w:after="80"/>
       </w:pPr>
@@ -9523,7 +9800,7 @@
         <w:pStyle w:val="ListParagraph"/>
         <w:numPr>
           <w:ilvl w:val="0"/>
-          <w:numId w:val="2"/>
+          <w:numId w:val="14"/>
         </w:numPr>
         <w:spacing w:after="80"/>
       </w:pPr>
@@ -9536,7 +9813,7 @@
         <w:pStyle w:val="ListParagraph"/>
         <w:numPr>
           <w:ilvl w:val="0"/>
-          <w:numId w:val="2"/>
+          <w:numId w:val="14"/>
         </w:numPr>
         <w:spacing w:after="80"/>
       </w:pPr>
@@ -9549,7 +9826,7 @@
         <w:pStyle w:val="ListParagraph"/>
         <w:numPr>
           <w:ilvl w:val="0"/>
-          <w:numId w:val="2"/>
+          <w:numId w:val="14"/>
         </w:numPr>
         <w:spacing w:after="80"/>
       </w:pPr>
@@ -9562,7 +9839,7 @@
         <w:pStyle w:val="ListParagraph"/>
         <w:numPr>
           <w:ilvl w:val="0"/>
-          <w:numId w:val="2"/>
+          <w:numId w:val="14"/>
         </w:numPr>
         <w:spacing w:after="80"/>
       </w:pPr>
@@ -9621,6 +9898,7 @@
       <w:tr>
         <w:trPr>
           <w:tblHeader/>
+          <w:cantSplit/>
         </w:trPr>
         <w:tc>
           <w:tcPr>
@@ -9714,6 +9992,9 @@
         </w:tc>
       </w:tr>
       <w:tr>
+        <w:trPr>
+          <w:cantSplit/>
+        </w:trPr>
         <w:tc>
           <w:tcPr>
             <w:tcW w:type="pct" w:w="30%"/>
@@ -9734,13 +10015,17 @@
             <w:pPr>
               <w:spacing w:after="0"/>
             </w:pPr>
-            <w:r>
-              <w:rPr>
-                <w:sz w:val="18"/>
-                <w:szCs w:val="18"/>
-              </w:rPr>
-              <w:t xml:space="preserve">Daily Momentum Engine</w:t>
-            </w:r>
+            <w:hyperlink r:id="rId164">
+              <w:r>
+                <w:rPr>
+                  <w:sz w:val="18"/>
+                  <w:szCs w:val="18"/>
+                  <w:color w:val="0563C1"/>
+                  <w:u w:val="single"/>
+                </w:rPr>
+                <w:t xml:space="preserve">Daily Momentum Engine</w:t>
+              </w:r>
+            </w:hyperlink>
           </w:p>
         </w:tc>
         <w:tc>
@@ -9803,6 +10088,9 @@
         </w:tc>
       </w:tr>
       <w:tr>
+        <w:trPr>
+          <w:cantSplit/>
+        </w:trPr>
         <w:tc>
           <w:tcPr>
             <w:tcW w:type="pct" w:w="30%"/>
@@ -9823,13 +10111,17 @@
             <w:pPr>
               <w:spacing w:after="0"/>
             </w:pPr>
-            <w:r>
-              <w:rPr>
-                <w:sz w:val="18"/>
-                <w:szCs w:val="18"/>
-              </w:rPr>
-              <w:t xml:space="preserve">Job-Application Tracker</w:t>
-            </w:r>
+            <w:hyperlink r:id="rId165">
+              <w:r>
+                <w:rPr>
+                  <w:sz w:val="18"/>
+                  <w:szCs w:val="18"/>
+                  <w:color w:val="0563C1"/>
+                  <w:u w:val="single"/>
+                </w:rPr>
+                <w:t xml:space="preserve">Job-Application Tracker</w:t>
+              </w:r>
+            </w:hyperlink>
           </w:p>
         </w:tc>
         <w:tc>
@@ -9892,6 +10184,9 @@
         </w:tc>
       </w:tr>
       <w:tr>
+        <w:trPr>
+          <w:cantSplit/>
+        </w:trPr>
         <w:tc>
           <w:tcPr>
             <w:tcW w:type="pct" w:w="30%"/>
@@ -9912,13 +10207,17 @@
             <w:pPr>
               <w:spacing w:after="0"/>
             </w:pPr>
-            <w:r>
-              <w:rPr>
-                <w:sz w:val="18"/>
-                <w:szCs w:val="18"/>
-              </w:rPr>
-              <w:t xml:space="preserve">Rejection Intelligence &amp; Action Advisory Engine</w:t>
-            </w:r>
+            <w:hyperlink r:id="rId166">
+              <w:r>
+                <w:rPr>
+                  <w:sz w:val="18"/>
+                  <w:szCs w:val="18"/>
+                  <w:color w:val="0563C1"/>
+                  <w:u w:val="single"/>
+                </w:rPr>
+                <w:t xml:space="preserve">Rejection Intelligence &amp; Action Advisory Engine</w:t>
+              </w:r>
+            </w:hyperlink>
           </w:p>
         </w:tc>
         <w:tc>
@@ -9981,6 +10280,9 @@
         </w:tc>
       </w:tr>
       <w:tr>
+        <w:trPr>
+          <w:cantSplit/>
+        </w:trPr>
         <w:tc>
           <w:tcPr>
             <w:tcW w:type="pct" w:w="30%"/>
@@ -10001,13 +10303,17 @@
             <w:pPr>
               <w:spacing w:after="0"/>
             </w:pPr>
-            <w:r>
-              <w:rPr>
-                <w:sz w:val="18"/>
-                <w:szCs w:val="18"/>
-              </w:rPr>
-              <w:t xml:space="preserve">Opportunity Recovery Intelligence Engine</w:t>
-            </w:r>
+            <w:hyperlink r:id="rId167">
+              <w:r>
+                <w:rPr>
+                  <w:sz w:val="18"/>
+                  <w:szCs w:val="18"/>
+                  <w:color w:val="0563C1"/>
+                  <w:u w:val="single"/>
+                </w:rPr>
+                <w:t xml:space="preserve">Opportunity Recovery Intelligence Engine</w:t>
+              </w:r>
+            </w:hyperlink>
           </w:p>
         </w:tc>
         <w:tc>
@@ -10070,6 +10376,9 @@
         </w:tc>
       </w:tr>
       <w:tr>
+        <w:trPr>
+          <w:cantSplit/>
+        </w:trPr>
         <w:tc>
           <w:tcPr>
             <w:tcW w:type="pct" w:w="30%"/>
@@ -10090,13 +10399,17 @@
             <w:pPr>
               <w:spacing w:after="0"/>
             </w:pPr>
-            <w:r>
-              <w:rPr>
-                <w:sz w:val="18"/>
-                <w:szCs w:val="18"/>
-              </w:rPr>
-              <w:t xml:space="preserve">Career Transition Announcement Builder</w:t>
-            </w:r>
+            <w:hyperlink r:id="rId168">
+              <w:r>
+                <w:rPr>
+                  <w:sz w:val="18"/>
+                  <w:szCs w:val="18"/>
+                  <w:color w:val="0563C1"/>
+                  <w:u w:val="single"/>
+                </w:rPr>
+                <w:t xml:space="preserve">Career Transition Announcement Builder</w:t>
+              </w:r>
+            </w:hyperlink>
           </w:p>
         </w:tc>
         <w:tc>
@@ -10180,6 +10493,9 @@
         <w:gridCol w:w="100"/>
       </w:tblGrid>
       <w:tr>
+        <w:trPr>
+          <w:cantSplit/>
+        </w:trPr>
         <w:tc>
           <w:tcPr>
             <w:tcBorders>
@@ -10264,11 +10580,6 @@
         </w:tc>
       </w:tr>
     </w:tbl>
-    <w:p>
-      <w:r>
-        <w:br w:type="page"/>
-      </w:r>
-    </w:p>
     <w:p>
       <w:pPr>
         <w:pStyle w:val="Heading1"/>
@@ -10353,6 +10664,7 @@
       <w:tr>
         <w:trPr>
           <w:tblHeader/>
+          <w:cantSplit/>
         </w:trPr>
         <w:tc>
           <w:tcPr>
@@ -10536,6 +10848,9 @@
         </w:tc>
       </w:tr>
       <w:tr>
+        <w:trPr>
+          <w:cantSplit/>
+        </w:trPr>
         <w:tc>
           <w:tcPr>
             <w:tcW w:type="pct" w:w="16%"/>
@@ -10749,6 +11064,7 @@
       <w:tr>
         <w:trPr>
           <w:tblHeader/>
+          <w:cantSplit/>
         </w:trPr>
         <w:tc>
           <w:tcPr>
@@ -10932,6 +11248,9 @@
         </w:tc>
       </w:tr>
       <w:tr>
+        <w:trPr>
+          <w:cantSplit/>
+        </w:trPr>
         <w:tc>
           <w:tcPr>
             <w:tcW w:type="pct" w:w="16%"/>
@@ -11145,6 +11464,7 @@
       <w:tr>
         <w:trPr>
           <w:tblHeader/>
+          <w:cantSplit/>
         </w:trPr>
         <w:tc>
           <w:tcPr>
@@ -11328,6 +11648,9 @@
         </w:tc>
       </w:tr>
       <w:tr>
+        <w:trPr>
+          <w:cantSplit/>
+        </w:trPr>
         <w:tc>
           <w:tcPr>
             <w:tcW w:type="pct" w:w="20%"/>
@@ -11541,6 +11864,7 @@
       <w:tr>
         <w:trPr>
           <w:tblHeader/>
+          <w:cantSplit/>
         </w:trPr>
         <w:tc>
           <w:tcPr>
@@ -11724,6 +12048,9 @@
         </w:tc>
       </w:tr>
       <w:tr>
+        <w:trPr>
+          <w:cantSplit/>
+        </w:trPr>
         <w:tc>
           <w:tcPr>
             <w:tcW w:type="pct" w:w="18%"/>
@@ -12051,11 +12378,6 @@
           <w:color w:val="555555"/>
         </w:rPr>
         <w:t xml:space="preserve">Tip: bold your four most important active applications. Review every other day. Don't review hourly.</w:t>
-      </w:r>
-    </w:p>
-    <w:p>
-      <w:r>
-        <w:br w:type="page"/>
       </w:r>
     </w:p>
     <w:p>
@@ -14279,11 +14601,6 @@
           <w:t xml:space="preserve">Create-New-Posting-File.ps1</w:t>
         </w:r>
       </w:hyperlink>
-    </w:p>
-    <w:p>
-      <w:r>
-        <w:br w:type="page"/>
-      </w:r>
     </w:p>
     <w:p>
       <w:pPr>
@@ -14577,6 +14894,78 @@
     </w:lvlOverride>
   </w:num>
   <w:num w:numId="2">
+    <w:abstractNumId w:val="2"/>
+    <w:lvlOverride w:ilvl="0">
+      <w:startOverride w:val="1"/>
+    </w:lvlOverride>
+  </w:num>
+  <w:num w:numId="3">
+    <w:abstractNumId w:val="2"/>
+    <w:lvlOverride w:ilvl="0">
+      <w:startOverride w:val="1"/>
+    </w:lvlOverride>
+  </w:num>
+  <w:num w:numId="4">
+    <w:abstractNumId w:val="2"/>
+    <w:lvlOverride w:ilvl="0">
+      <w:startOverride w:val="1"/>
+    </w:lvlOverride>
+  </w:num>
+  <w:num w:numId="5">
+    <w:abstractNumId w:val="2"/>
+    <w:lvlOverride w:ilvl="0">
+      <w:startOverride w:val="1"/>
+    </w:lvlOverride>
+  </w:num>
+  <w:num w:numId="6">
+    <w:abstractNumId w:val="2"/>
+    <w:lvlOverride w:ilvl="0">
+      <w:startOverride w:val="1"/>
+    </w:lvlOverride>
+  </w:num>
+  <w:num w:numId="7">
+    <w:abstractNumId w:val="2"/>
+    <w:lvlOverride w:ilvl="0">
+      <w:startOverride w:val="1"/>
+    </w:lvlOverride>
+  </w:num>
+  <w:num w:numId="8">
+    <w:abstractNumId w:val="2"/>
+    <w:lvlOverride w:ilvl="0">
+      <w:startOverride w:val="1"/>
+    </w:lvlOverride>
+  </w:num>
+  <w:num w:numId="9">
+    <w:abstractNumId w:val="2"/>
+    <w:lvlOverride w:ilvl="0">
+      <w:startOverride w:val="1"/>
+    </w:lvlOverride>
+  </w:num>
+  <w:num w:numId="10">
+    <w:abstractNumId w:val="2"/>
+    <w:lvlOverride w:ilvl="0">
+      <w:startOverride w:val="1"/>
+    </w:lvlOverride>
+  </w:num>
+  <w:num w:numId="11">
+    <w:abstractNumId w:val="2"/>
+    <w:lvlOverride w:ilvl="0">
+      <w:startOverride w:val="1"/>
+    </w:lvlOverride>
+  </w:num>
+  <w:num w:numId="12">
+    <w:abstractNumId w:val="2"/>
+    <w:lvlOverride w:ilvl="0">
+      <w:startOverride w:val="1"/>
+    </w:lvlOverride>
+  </w:num>
+  <w:num w:numId="13">
+    <w:abstractNumId w:val="2"/>
+    <w:lvlOverride w:ilvl="0">
+      <w:startOverride w:val="1"/>
+    </w:lvlOverride>
+  </w:num>
+  <w:num w:numId="14">
     <w:abstractNumId w:val="2"/>
     <w:lvlOverride w:ilvl="0">
       <w:startOverride w:val="1"/>

</xml_diff>